<commit_message>
Extend feature catalogue docx integration test
add package structure within the schema

Signed-off-by: Johannes Echterhoff <echterhoff@interactive-instruments.de>
</commit_message>
<xml_diff>
--- a/shapechange-app/src/integrationtests/featureCatalogue/docxFeatureCatalogue/reference/test.docx
+++ b/shapechange-app/src/integrationtests/featureCatalogue/docxFeatureCatalogue/reference/test.docx
@@ -1,6 +1,6 @@
 
 <file path=word/document.xml><?xml version="1.0" encoding="utf-8"?>
-<w:document xmlns:wpc="http://schemas.microsoft.com/office/word/2010/wordprocessingCanvas" xmlns:mc="http://schemas.openxmlformats.org/markup-compatibility/2006" xmlns:o="urn:schemas-microsoft-com:office:office" xmlns:r="http://schemas.openxmlformats.org/officeDocument/2006/relationships" xmlns:m="http://schemas.openxmlformats.org/officeDocument/2006/math" xmlns:v="urn:schemas-microsoft-com:vml" xmlns:wp14="http://schemas.microsoft.com/office/word/2010/wordprocessingDrawing" xmlns:wp="http://schemas.openxmlformats.org/drawingml/2006/wordprocessingDrawing" xmlns:w10="urn:schemas-microsoft-com:office:word" xmlns:w="http://schemas.openxmlformats.org/wordprocessingml/2006/main" xmlns:w14="http://schemas.microsoft.com/office/word/2010/wordml" xmlns:w15="http://schemas.microsoft.com/office/word/2012/wordml" xmlns:wpg="http://schemas.microsoft.com/office/word/2010/wordprocessingGroup" xmlns:wpi="http://schemas.microsoft.com/office/word/2010/wordprocessingInk" xmlns:wne="http://schemas.microsoft.com/office/word/2006/wordml" xmlns:wps="http://schemas.microsoft.com/office/word/2010/wordprocessingShape" mc:Ignorable="w14 w15 wp14">
+<w:document xmlns:m="http://schemas.openxmlformats.org/officeDocument/2006/math" xmlns:mc="http://schemas.openxmlformats.org/markup-compatibility/2006" xmlns:o="urn:schemas-microsoft-com:office:office" xmlns:r="http://schemas.openxmlformats.org/officeDocument/2006/relationships" xmlns:v="urn:schemas-microsoft-com:vml" xmlns:w="http://schemas.openxmlformats.org/wordprocessingml/2006/main" xmlns:w10="urn:schemas-microsoft-com:office:word" xmlns:w14="http://schemas.microsoft.com/office/word/2010/wordml" xmlns:w15="http://schemas.microsoft.com/office/word/2012/wordml" xmlns:wne="http://schemas.microsoft.com/office/word/2006/wordml" xmlns:wp="http://schemas.openxmlformats.org/drawingml/2006/wordprocessingDrawing" xmlns:wp14="http://schemas.microsoft.com/office/word/2010/wordprocessingDrawing" xmlns:wpc="http://schemas.microsoft.com/office/word/2010/wordprocessingCanvas" xmlns:wpg="http://schemas.microsoft.com/office/word/2010/wordprocessingGroup" xmlns:wpi="http://schemas.microsoft.com/office/word/2010/wordprocessingInk" xmlns:wps="http://schemas.microsoft.com/office/word/2010/wordprocessingShape" mc:Ignorable="w14 w15 wp14">
   <w:body>
     <w:p>
       <w:pPr>
@@ -100,6 +100,54 @@
       </w:pPr>
       <w:r>
         <w:t>1.0</w:t>
+      </w:r>
+    </w:p>
+    <w:p>
+      <w:r>
+        <w:rPr>
+          <w:b/>
+        </w:rPr>
+        <w:t>Sub-package:</w:t>
+      </w:r>
+    </w:p>
+    <w:p>
+      <w:pPr>
+        <w:ind w:left="708"/>
+      </w:pPr>
+      <w:r>
+        <w:fldChar w:fldCharType="begin"/>
+      </w:r>
+      <w:r>
+        <w:instrText xml:space="preserve"> REF _Ref_P7 \h </w:instrText>
+      </w:r>
+      <w:r>
+        <w:fldChar w:fldCharType="separate"/>
+      </w:r>
+      <w:r>
+        <w:t>bundle1</w:t>
+      </w:r>
+      <w:r>
+        <w:fldChar w:fldCharType="end"/>
+      </w:r>
+    </w:p>
+    <w:p>
+      <w:pPr>
+        <w:ind w:left="708"/>
+      </w:pPr>
+      <w:r>
+        <w:fldChar w:fldCharType="begin"/>
+      </w:r>
+      <w:r>
+        <w:instrText xml:space="preserve"> REF _Ref_P8 \h </w:instrText>
+      </w:r>
+      <w:r>
+        <w:fldChar w:fldCharType="separate"/>
+      </w:r>
+      <w:r>
+        <w:t>bundle2</w:t>
+      </w:r>
+      <w:r>
+        <w:fldChar w:fldCharType="end"/>
       </w:r>
     </w:p>
     <w:p>
@@ -6071,6 +6119,524 @@
                 <w:p>
                   <w:r>
                     <w:t>CharacterString</w:t>
+                  </w:r>
+                </w:p>
+              </w:tc>
+            </w:tr>
+          </w:tbl>
+          <w:p/>
+        </w:tc>
+      </w:tr>
+    </w:tbl>
+    <w:p/>
+    <w:p>
+      <w:pPr>
+        <w:pStyle w:val="berschrift2"/>
+      </w:pPr>
+      <w:bookmarkStart w:id="0" w:name="_Ref_P7"/>
+      <w:r>
+        <w:t>Package: bundle1</w:t>
+      </w:r>
+      <w:bookmarkEnd w:id="0"/>
+    </w:p>
+    <w:p>
+      <w:r>
+        <w:rPr>
+          <w:b/>
+        </w:rPr>
+        <w:t>Sub-package:</w:t>
+      </w:r>
+    </w:p>
+    <w:p>
+      <w:pPr>
+        <w:ind w:left="708"/>
+      </w:pPr>
+      <w:r>
+        <w:fldChar w:fldCharType="begin"/>
+      </w:r>
+      <w:r>
+        <w:instrText xml:space="preserve"> REF _Ref_P5 \h </w:instrText>
+      </w:r>
+      <w:r>
+        <w:fldChar w:fldCharType="separate"/>
+      </w:r>
+      <w:r>
+        <w:t>Leaf1</w:t>
+      </w:r>
+      <w:r>
+        <w:fldChar w:fldCharType="end"/>
+      </w:r>
+    </w:p>
+    <w:p>
+      <w:pPr>
+        <w:ind w:left="708"/>
+      </w:pPr>
+      <w:r>
+        <w:fldChar w:fldCharType="begin"/>
+      </w:r>
+      <w:r>
+        <w:instrText xml:space="preserve"> REF _Ref_P6 \h </w:instrText>
+      </w:r>
+      <w:r>
+        <w:fldChar w:fldCharType="separate"/>
+      </w:r>
+      <w:r>
+        <w:t>Leaf2</w:t>
+      </w:r>
+      <w:r>
+        <w:fldChar w:fldCharType="end"/>
+      </w:r>
+    </w:p>
+    <w:p>
+      <w:r>
+        <w:rPr>
+          <w:b/>
+        </w:rPr>
+        <w:t>Parent package:</w:t>
+      </w:r>
+    </w:p>
+    <w:p>
+      <w:pPr>
+        <w:ind w:left="708"/>
+      </w:pPr>
+      <w:r>
+        <w:fldChar w:fldCharType="begin"/>
+      </w:r>
+      <w:r>
+        <w:instrText xml:space="preserve"> REF _Ref_P4 \h </w:instrText>
+      </w:r>
+      <w:r>
+        <w:fldChar w:fldCharType="separate"/>
+      </w:r>
+      <w:r>
+        <w:t>Test Schema</w:t>
+      </w:r>
+      <w:r>
+        <w:fldChar w:fldCharType="end"/>
+      </w:r>
+    </w:p>
+    <w:p>
+      <w:pPr>
+        <w:pStyle w:val="berschrift2"/>
+      </w:pPr>
+      <w:bookmarkStart w:id="0" w:name="_Ref_P5"/>
+      <w:r>
+        <w:t>Package: Leaf1</w:t>
+      </w:r>
+      <w:bookmarkEnd w:id="0"/>
+    </w:p>
+    <w:p>
+      <w:r>
+        <w:rPr>
+          <w:b/>
+        </w:rPr>
+        <w:t>Parent package:</w:t>
+      </w:r>
+    </w:p>
+    <w:p>
+      <w:pPr>
+        <w:ind w:left="708"/>
+      </w:pPr>
+      <w:r>
+        <w:fldChar w:fldCharType="begin"/>
+      </w:r>
+      <w:r>
+        <w:instrText xml:space="preserve"> REF _Ref_P7 \h </w:instrText>
+      </w:r>
+      <w:r>
+        <w:fldChar w:fldCharType="separate"/>
+      </w:r>
+      <w:r>
+        <w:t>bundle1</w:t>
+      </w:r>
+      <w:r>
+        <w:fldChar w:fldCharType="end"/>
+      </w:r>
+    </w:p>
+    <w:p>
+      <w:pPr>
+        <w:pStyle w:val="berschrift3"/>
+      </w:pPr>
+      <w:bookmarkStart w:id="0" w:name="_Ref_C17"/>
+      <w:r>
+        <w:t>Leaf1_FT1</w:t>
+      </w:r>
+      <w:bookmarkEnd w:id="0"/>
+    </w:p>
+    <w:tbl>
+      <w:tblPr>
+        <w:tblW w:type="pct" w:w="5000"/>
+        <w:tblBorders>
+          <w:top w:color="auto" w:space="0" w:sz="4" w:val="single"/>
+          <w:left w:color="auto" w:space="0" w:sz="4" w:val="single"/>
+          <w:bottom w:color="auto" w:space="0" w:sz="4" w:val="single"/>
+          <w:right w:color="auto" w:space="0" w:sz="4" w:val="single"/>
+          <w:insideH w:color="auto" w:space="0" w:sz="4" w:val="single"/>
+          <w:insideV w:color="auto" w:space="0" w:sz="0" w:val="none"/>
+        </w:tblBorders>
+      </w:tblPr>
+      <w:tblGrid/>
+      <w:tr>
+        <w:tc>
+          <w:tcPr>
+            <w:tcW w:type="pct" w:w="5000"/>
+          </w:tcPr>
+          <w:p>
+            <w:pPr/>
+            <w:r>
+              <w:rPr>
+                <w:b/>
+              </w:rPr>
+              <w:t>Leaf1_FT1</w:t>
+            </w:r>
+          </w:p>
+          <w:tbl>
+            <w:tblPr>
+              <w:tblW w:type="pct" w:w="5000"/>
+              <w:tblBorders>
+                <w:top w:color="auto" w:space="0" w:sz="0" w:val="none"/>
+                <w:left w:color="auto" w:space="0" w:sz="0" w:val="none"/>
+                <w:bottom w:color="auto" w:space="0" w:sz="0" w:val="none"/>
+                <w:right w:color="auto" w:space="0" w:sz="0" w:val="none"/>
+                <w:insideH w:color="auto" w:space="0" w:sz="0" w:val="none"/>
+                <w:insideV w:color="auto" w:space="0" w:sz="0" w:val="none"/>
+              </w:tblBorders>
+            </w:tblPr>
+            <w:tblGrid/>
+            <w:tr>
+              <w:tc>
+                <w:tcPr>
+                  <w:tcW w:type="pct" w:w="1500"/>
+                </w:tcPr>
+                <w:p>
+                  <w:pPr>
+                    <w:ind w:left="425"/>
+                  </w:pPr>
+                  <w:r>
+                    <w:rPr>
+                      <w:b/>
+                    </w:rPr>
+                    <w:t>Type:</w:t>
+                  </w:r>
+                </w:p>
+              </w:tc>
+              <w:tc>
+                <w:tcPr>
+                  <w:tcW w:type="pct" w:w="3500"/>
+                </w:tcPr>
+                <w:p>
+                  <w:r>
+                    <w:t>Feature type</w:t>
+                  </w:r>
+                </w:p>
+              </w:tc>
+            </w:tr>
+          </w:tbl>
+          <w:p/>
+        </w:tc>
+      </w:tr>
+    </w:tbl>
+    <w:p/>
+    <w:p>
+      <w:pPr>
+        <w:pStyle w:val="berschrift2"/>
+      </w:pPr>
+      <w:bookmarkStart w:id="0" w:name="_Ref_P6"/>
+      <w:r>
+        <w:t>Package: Leaf2</w:t>
+      </w:r>
+      <w:bookmarkEnd w:id="0"/>
+    </w:p>
+    <w:p>
+      <w:r>
+        <w:rPr>
+          <w:b/>
+        </w:rPr>
+        <w:t>Parent package:</w:t>
+      </w:r>
+    </w:p>
+    <w:p>
+      <w:pPr>
+        <w:ind w:left="708"/>
+      </w:pPr>
+      <w:r>
+        <w:fldChar w:fldCharType="begin"/>
+      </w:r>
+      <w:r>
+        <w:instrText xml:space="preserve"> REF _Ref_P7 \h </w:instrText>
+      </w:r>
+      <w:r>
+        <w:fldChar w:fldCharType="separate"/>
+      </w:r>
+      <w:r>
+        <w:t>bundle1</w:t>
+      </w:r>
+      <w:r>
+        <w:fldChar w:fldCharType="end"/>
+      </w:r>
+    </w:p>
+    <w:p>
+      <w:pPr>
+        <w:pStyle w:val="berschrift3"/>
+      </w:pPr>
+      <w:bookmarkStart w:id="0" w:name="_Ref_C18"/>
+      <w:r>
+        <w:t>Leaf2_FT1</w:t>
+      </w:r>
+      <w:bookmarkEnd w:id="0"/>
+    </w:p>
+    <w:tbl>
+      <w:tblPr>
+        <w:tblW w:type="pct" w:w="5000"/>
+        <w:tblBorders>
+          <w:top w:color="auto" w:space="0" w:sz="4" w:val="single"/>
+          <w:left w:color="auto" w:space="0" w:sz="4" w:val="single"/>
+          <w:bottom w:color="auto" w:space="0" w:sz="4" w:val="single"/>
+          <w:right w:color="auto" w:space="0" w:sz="4" w:val="single"/>
+          <w:insideH w:color="auto" w:space="0" w:sz="4" w:val="single"/>
+          <w:insideV w:color="auto" w:space="0" w:sz="0" w:val="none"/>
+        </w:tblBorders>
+      </w:tblPr>
+      <w:tblGrid/>
+      <w:tr>
+        <w:tc>
+          <w:tcPr>
+            <w:tcW w:type="pct" w:w="5000"/>
+          </w:tcPr>
+          <w:p>
+            <w:pPr/>
+            <w:r>
+              <w:rPr>
+                <w:b/>
+              </w:rPr>
+              <w:t>Leaf2_FT1</w:t>
+            </w:r>
+          </w:p>
+          <w:tbl>
+            <w:tblPr>
+              <w:tblW w:type="pct" w:w="5000"/>
+              <w:tblBorders>
+                <w:top w:color="auto" w:space="0" w:sz="0" w:val="none"/>
+                <w:left w:color="auto" w:space="0" w:sz="0" w:val="none"/>
+                <w:bottom w:color="auto" w:space="0" w:sz="0" w:val="none"/>
+                <w:right w:color="auto" w:space="0" w:sz="0" w:val="none"/>
+                <w:insideH w:color="auto" w:space="0" w:sz="0" w:val="none"/>
+                <w:insideV w:color="auto" w:space="0" w:sz="0" w:val="none"/>
+              </w:tblBorders>
+            </w:tblPr>
+            <w:tblGrid/>
+            <w:tr>
+              <w:tc>
+                <w:tcPr>
+                  <w:tcW w:type="pct" w:w="1500"/>
+                </w:tcPr>
+                <w:p>
+                  <w:pPr>
+                    <w:ind w:left="425"/>
+                  </w:pPr>
+                  <w:r>
+                    <w:rPr>
+                      <w:b/>
+                    </w:rPr>
+                    <w:t>Type:</w:t>
+                  </w:r>
+                </w:p>
+              </w:tc>
+              <w:tc>
+                <w:tcPr>
+                  <w:tcW w:type="pct" w:w="3500"/>
+                </w:tcPr>
+                <w:p>
+                  <w:r>
+                    <w:t>Feature type</w:t>
+                  </w:r>
+                </w:p>
+              </w:tc>
+            </w:tr>
+          </w:tbl>
+          <w:p/>
+        </w:tc>
+      </w:tr>
+    </w:tbl>
+    <w:p/>
+    <w:p>
+      <w:pPr>
+        <w:pStyle w:val="berschrift2"/>
+      </w:pPr>
+      <w:bookmarkStart w:id="0" w:name="_Ref_P8"/>
+      <w:r>
+        <w:t>Package: bundle2</w:t>
+      </w:r>
+      <w:bookmarkEnd w:id="0"/>
+    </w:p>
+    <w:p>
+      <w:r>
+        <w:rPr>
+          <w:b/>
+        </w:rPr>
+        <w:t>Sub-package:</w:t>
+      </w:r>
+    </w:p>
+    <w:p>
+      <w:pPr>
+        <w:ind w:left="708"/>
+      </w:pPr>
+      <w:r>
+        <w:fldChar w:fldCharType="begin"/>
+      </w:r>
+      <w:r>
+        <w:instrText xml:space="preserve"> REF _Ref_P9 \h </w:instrText>
+      </w:r>
+      <w:r>
+        <w:fldChar w:fldCharType="separate"/>
+      </w:r>
+      <w:r>
+        <w:t>Leaf3</w:t>
+      </w:r>
+      <w:r>
+        <w:fldChar w:fldCharType="end"/>
+      </w:r>
+    </w:p>
+    <w:p>
+      <w:r>
+        <w:rPr>
+          <w:b/>
+        </w:rPr>
+        <w:t>Parent package:</w:t>
+      </w:r>
+    </w:p>
+    <w:p>
+      <w:pPr>
+        <w:ind w:left="708"/>
+      </w:pPr>
+      <w:r>
+        <w:fldChar w:fldCharType="begin"/>
+      </w:r>
+      <w:r>
+        <w:instrText xml:space="preserve"> REF _Ref_P4 \h </w:instrText>
+      </w:r>
+      <w:r>
+        <w:fldChar w:fldCharType="separate"/>
+      </w:r>
+      <w:r>
+        <w:t>Test Schema</w:t>
+      </w:r>
+      <w:r>
+        <w:fldChar w:fldCharType="end"/>
+      </w:r>
+    </w:p>
+    <w:p>
+      <w:pPr>
+        <w:pStyle w:val="berschrift2"/>
+      </w:pPr>
+      <w:bookmarkStart w:id="0" w:name="_Ref_P9"/>
+      <w:r>
+        <w:t>Package: Leaf3</w:t>
+      </w:r>
+      <w:bookmarkEnd w:id="0"/>
+    </w:p>
+    <w:p>
+      <w:r>
+        <w:rPr>
+          <w:b/>
+        </w:rPr>
+        <w:t>Parent package:</w:t>
+      </w:r>
+    </w:p>
+    <w:p>
+      <w:pPr>
+        <w:ind w:left="708"/>
+      </w:pPr>
+      <w:r>
+        <w:fldChar w:fldCharType="begin"/>
+      </w:r>
+      <w:r>
+        <w:instrText xml:space="preserve"> REF _Ref_P8 \h </w:instrText>
+      </w:r>
+      <w:r>
+        <w:fldChar w:fldCharType="separate"/>
+      </w:r>
+      <w:r>
+        <w:t>bundle2</w:t>
+      </w:r>
+      <w:r>
+        <w:fldChar w:fldCharType="end"/>
+      </w:r>
+    </w:p>
+    <w:p>
+      <w:pPr>
+        <w:pStyle w:val="berschrift3"/>
+      </w:pPr>
+      <w:bookmarkStart w:id="0" w:name="_Ref_C19"/>
+      <w:r>
+        <w:t>Leaf3_FT1</w:t>
+      </w:r>
+      <w:bookmarkEnd w:id="0"/>
+    </w:p>
+    <w:tbl>
+      <w:tblPr>
+        <w:tblW w:type="pct" w:w="5000"/>
+        <w:tblBorders>
+          <w:top w:color="auto" w:space="0" w:sz="4" w:val="single"/>
+          <w:left w:color="auto" w:space="0" w:sz="4" w:val="single"/>
+          <w:bottom w:color="auto" w:space="0" w:sz="4" w:val="single"/>
+          <w:right w:color="auto" w:space="0" w:sz="4" w:val="single"/>
+          <w:insideH w:color="auto" w:space="0" w:sz="4" w:val="single"/>
+          <w:insideV w:color="auto" w:space="0" w:sz="0" w:val="none"/>
+        </w:tblBorders>
+      </w:tblPr>
+      <w:tblGrid/>
+      <w:tr>
+        <w:tc>
+          <w:tcPr>
+            <w:tcW w:type="pct" w:w="5000"/>
+          </w:tcPr>
+          <w:p>
+            <w:pPr/>
+            <w:r>
+              <w:rPr>
+                <w:b/>
+              </w:rPr>
+              <w:t>Leaf3_FT1</w:t>
+            </w:r>
+          </w:p>
+          <w:tbl>
+            <w:tblPr>
+              <w:tblW w:type="pct" w:w="5000"/>
+              <w:tblBorders>
+                <w:top w:color="auto" w:space="0" w:sz="0" w:val="none"/>
+                <w:left w:color="auto" w:space="0" w:sz="0" w:val="none"/>
+                <w:bottom w:color="auto" w:space="0" w:sz="0" w:val="none"/>
+                <w:right w:color="auto" w:space="0" w:sz="0" w:val="none"/>
+                <w:insideH w:color="auto" w:space="0" w:sz="0" w:val="none"/>
+                <w:insideV w:color="auto" w:space="0" w:sz="0" w:val="none"/>
+              </w:tblBorders>
+            </w:tblPr>
+            <w:tblGrid/>
+            <w:tr>
+              <w:tc>
+                <w:tcPr>
+                  <w:tcW w:type="pct" w:w="1500"/>
+                </w:tcPr>
+                <w:p>
+                  <w:pPr>
+                    <w:ind w:left="425"/>
+                  </w:pPr>
+                  <w:r>
+                    <w:rPr>
+                      <w:b/>
+                    </w:rPr>
+                    <w:t>Type:</w:t>
+                  </w:r>
+                </w:p>
+              </w:tc>
+              <w:tc>
+                <w:tcPr>
+                  <w:tcW w:type="pct" w:w="3500"/>
+                </w:tcPr>
+                <w:p>
+                  <w:r>
+                    <w:t>Feature type</w:t>
                   </w:r>
                 </w:p>
               </w:tc>

</xml_diff>